<commit_message>
Ajusta seção de indicadores de desempenho do dossiê
- Explica que a pausa de 6 meses sem editais (set/2024-fev/2025) foi
  causada pela atualização da Tabela de Temporalidade de Documentos,
  não por falta de automação (que ainda não existia no período).
- Deixa explícito que os editais dependem de solicitação formal das
  Superintendências Regionais à CADA — a automação reduz o tempo de
  processamento de cada solicitação, mas não gera demanda por si só,
  o que contextualiza os números de frequência/volume apresentados.

Co-Authored-By: Claude Sonnet 5 <noreply@anthropic.com>
Claude-Session: https://claude.ai/code/session_014bdXuuNNiSb6ZTfo5bsJWD
</commit_message>
<xml_diff>
--- a/Documentacao/Dossie_Tecnico_Editais_Eliminacao.docx
+++ b/Documentacao/Dossie_Tecnico_Editais_Eliminacao.docx
@@ -1688,6 +1688,21 @@
         <w:t xml:space="preserve">O sistema entrou em operação em outubro de 2025. A própria planilha de controle mantém, na aba "Controle de Editais", o histórico de todos os editais publicados desde 2023 — o que permite comparar, com dados reais, o ritmo de trabalho antes e depois da automação.</w:t>
       </w:r>
     </w:p>
+    <w:p>
+      <w:pPr>
+        <w:spacing w:after="160" w:line="300"/>
+        <w:jc w:val="both"/>
+      </w:pPr>
+      <w:r>
+        <w:rPr>
+          <w:rFonts w:ascii="Open Sans" w:cs="Open Sans" w:eastAsia="Open Sans" w:hAnsi="Open Sans"/>
+          <w:color w:val="3A3A3A"/>
+          <w:sz w:val="22"/>
+          <w:szCs w:val="22"/>
+        </w:rPr>
+        <w:t xml:space="preserve">Antes de olhar para os números, vale contextualizar como a demanda chega até a CADA: os editais não são produzidos por iniciativa própria da Comissão de Avaliação de Documentos e Acesso, mas sim a partir de solicitações formais das Superintendências Regionais, que identificam e encaminham os documentos elegíveis para eliminação. Ou seja, o volume de editais publicados em um determinado período reflete tanto a capacidade de processamento da CADA quanto o volume de solicitações recebidas — a automação reduz o tempo de processamento de cada solicitação, mas não cria demanda por si só.</w:t>
+      </w:r>
+    </w:p>
     <w:tbl>
       <w:tblPr>
         <w:tblW w:type="pct" w:w="100%"/>
@@ -2294,7 +2309,7 @@
           <w:sz w:val="19"/>
           <w:szCs w:val="19"/>
         </w:rPr>
-        <w:t xml:space="preserve">Metodologia e ressalvas: os números consideram os 975 registros publicados entre 06/01/2023 e 30/09/2025, comparados aos 620 registros publicados entre 02/10/2025 e 04/08/2026, ambos extraídos da aba "Controle de Editais" da própria planilha de controle. "Meses ativos" são meses com pelo menos um edital publicado, para não distorcer a média com os 6 meses sem nenhum registro observados entre setembro/2024 e fevereiro/2025 (anteriores à automação e não atribuíveis a ela). Por se tratar de uma comparação de períodos distintos, outros fatores além da automação — como mudanças de equipe ou de prioridades da área — podem ter contribuído para a variação observada; ainda assim, o aumento consistente na frequência de publicação é compatível com uma redução do tempo necessário para preparar cada rascunho de edital.</w:t>
+        <w:t xml:space="preserve">Metodologia e ressalvas: os números consideram os 975 registros publicados entre 06/01/2023 e 30/09/2025, comparados aos 620 registros publicados entre 02/10/2025 e 04/08/2026, ambos extraídos da aba "Controle de Editais" da própria planilha de controle. "Meses ativos" são meses com pelo menos um edital publicado, para não distorcer a média com os 6 meses sem nenhum registro observados entre setembro/2024 e fevereiro/2025 — período em que a elaboração de editais ficou pausada em função da atualização da Tabela de Temporalidade de Documentos, e não por causa da automação (que ainda não existia nesse período). Por se tratar de uma comparação de períodos distintos, outros fatores além da automação — como a atualização da própria Tabela de Temporalidade, mudanças de equipe, ou o volume de solicitações recebidas das Superintendências Regionais — também influenciam esses números; ainda assim, o aumento consistente na frequência de publicação é compatível com uma redução do tempo necessário para preparar cada rascunho de edital.</w:t>
       </w:r>
     </w:p>
     <w:p>

</xml_diff>